<commit_message>
Pre-beta audit: bring all install docs in line with v0.11.0 flow
- README.md: replaced unzip + right-click flow with .dmg + access code
  + license dialog flow. Added Distribution architecture section.
- Send Cold Bore to friends.md: replaced GitHub-releases share link
  with website + access code; new email templates; added v0.9-v0.11
  to versions table; flagged that access codes shouldn't be shared.
- Cold Bore -- Quick Start.docx: regenerated Install section for the
  .dmg + license-dialog flow (removed right-click step, added Step 4
  for pasting the access code on first launch).

The Quick Start docx update is in the project file; will land in
testers' downloads on the next release rebuild + R2 upload (the
v0.11.0 .dmg/.zip currently in R2 still has the older docx).

Co-Authored-By: Claude Opus 4.7 (1M context) <noreply@anthropic.com>
</commit_message>
<xml_diff>
--- a/Cold Bore — Quick Start.docx
+++ b/Cold Bore — Quick Start.docx
@@ -4,102 +4,134 @@
   <w:body>
     <w:p>
       <w:pPr>
-        <w:jc w:val="center"/>
+        <w:pStyle w:val="Title"/>
       </w:pPr>
       <w:r>
         <w:rPr>
-          <w:rFonts w:ascii="Arial" w:hAnsi="Arial"/>
-          <w:b/>
-          <w:sz w:val="44"/>
+          <w:color w:val="D97706"/>
         </w:rPr>
         <w:t>Cold Bore — Quick Start</w:t>
       </w:r>
     </w:p>
     <w:p>
-      <w:pPr>
-        <w:jc w:val="center"/>
-      </w:pPr>
       <w:r>
         <w:rPr>
-          <w:i/>
-          <w:color w:val="555555"/>
-          <w:sz w:val="22"/>
+          <w:b w:val="0"/>
+          <w:sz w:val="24"/>
         </w:rPr>
         <w:t>Drag Garmin &amp; BallisticX CSVs in. Get a recommended load out.</w:t>
       </w:r>
     </w:p>
+    <w:p/>
     <w:p>
+      <w:pPr>
+        <w:pStyle w:val="Heading1"/>
+      </w:pPr>
       <w:r>
         <w:rPr>
-          <w:rFonts w:ascii="Arial" w:hAnsi="Arial"/>
-          <w:b/>
-          <w:color w:val="C04A06"/>
-          <w:sz w:val="28"/>
+          <w:color w:val="D97706"/>
         </w:rPr>
         <w:t>Install</w:t>
       </w:r>
     </w:p>
     <w:p>
+      <w:pPr>
+        <w:ind w:left="360"/>
+      </w:pPr>
       <w:r>
         <w:rPr>
-          <w:rFonts w:ascii="Arial" w:hAnsi="Arial"/>
           <w:b/>
-          <w:color w:val="C04A06"/>
           <w:sz w:val="22"/>
         </w:rPr>
-        <w:t xml:space="preserve">1.  </w:t>
+        <w:t xml:space="preserve">1. </w:t>
       </w:r>
       <w:r>
         <w:rPr>
-          <w:rFonts w:ascii="Arial" w:hAnsi="Arial"/>
           <w:sz w:val="22"/>
         </w:rPr>
-        <w:t>Unzip the file you received and drag Cold Bore.app to Applications.</w:t>
+        <w:t>Double-click the Cold.Bore.dmg you downloaded. A window opens with the Cold Bore icon and an Applications shortcut.</w:t>
       </w:r>
     </w:p>
     <w:p>
+      <w:pPr>
+        <w:ind w:left="360"/>
+      </w:pPr>
       <w:r>
         <w:rPr>
-          <w:rFonts w:ascii="Arial" w:hAnsi="Arial"/>
           <w:b/>
-          <w:color w:val="C04A06"/>
           <w:sz w:val="22"/>
         </w:rPr>
-        <w:t xml:space="preserve">2.  </w:t>
+        <w:t xml:space="preserve">2. </w:t>
       </w:r>
       <w:r>
         <w:rPr>
-          <w:rFonts w:ascii="Arial" w:hAnsi="Arial"/>
           <w:sz w:val="22"/>
         </w:rPr>
-        <w:t>RIGHT-CLICK Cold Bore.app and choose Open, then click Open again on the security prompt. (Only the first time — double-click after that.)</w:t>
+        <w:t>Drag Cold Bore onto the Applications shortcut in the same window. Eject the disk image (click the eject arrow next to it in the Finder sidebar, or just close the window — it'll go away on the next restart).</w:t>
       </w:r>
     </w:p>
     <w:p>
+      <w:pPr>
+        <w:ind w:left="360"/>
+      </w:pPr>
       <w:r>
         <w:rPr>
-          <w:rFonts w:ascii="Arial" w:hAnsi="Arial"/>
           <w:b/>
-          <w:color w:val="C04A06"/>
           <w:sz w:val="22"/>
         </w:rPr>
-        <w:t xml:space="preserve">3.  </w:t>
+        <w:t xml:space="preserve">3. </w:t>
       </w:r>
       <w:r>
         <w:rPr>
-          <w:rFonts w:ascii="Arial" w:hAnsi="Arial"/>
+          <w:sz w:val="22"/>
+        </w:rPr>
+        <w:t>Open Cold Bore from your Applications folder. (Cold Bore is signed and notarized by Apple, so it opens cleanly — no right-click trick needed.)</w:t>
+      </w:r>
+    </w:p>
+    <w:p>
+      <w:pPr>
+        <w:ind w:left="360"/>
+      </w:pPr>
+      <w:r>
+        <w:rPr>
+          <w:b/>
+          <w:sz w:val="22"/>
+        </w:rPr>
+        <w:t xml:space="preserve">4. </w:t>
+      </w:r>
+      <w:r>
+        <w:rPr>
+          <w:sz w:val="22"/>
+        </w:rPr>
+        <w:t>A license dialog appears. Paste the access code you were emailed. Click Unlock Cold Bore.</w:t>
+      </w:r>
+    </w:p>
+    <w:p>
+      <w:pPr>
+        <w:ind w:left="360"/>
+      </w:pPr>
+      <w:r>
+        <w:rPr>
+          <w:b/>
+          <w:sz w:val="22"/>
+        </w:rPr>
+        <w:t xml:space="preserve">5. </w:t>
+      </w:r>
+      <w:r>
+        <w:rPr>
           <w:sz w:val="22"/>
         </w:rPr>
         <w:t>On first launch, accept the disclaimer and the default folder location. A 6-step tour follows; skip it if you'd like — it lives in Tools → How to Use Cold Bore… anytime.</w:t>
       </w:r>
     </w:p>
+    <w:p/>
     <w:p>
+      <w:pPr>
+        <w:pStyle w:val="Heading1"/>
+      </w:pPr>
       <w:r>
         <w:rPr>
-          <w:rFonts w:ascii="Arial" w:hAnsi="Arial"/>
-          <w:b/>
-          <w:color w:val="C04A06"/>
-          <w:sz w:val="28"/>
+          <w:color w:val="D97706"/>
         </w:rPr>
         <w:t>Name your sessions</w:t>
       </w:r>
@@ -107,7 +139,7 @@
     <w:p>
       <w:r>
         <w:rPr>
-          <w:rFonts w:ascii="Arial" w:hAnsi="Arial"/>
+          <w:b w:val="0"/>
           <w:sz w:val="22"/>
         </w:rPr>
         <w:t>Cold Bore sorts your data by name. Use this format (type only the bold part — the parenthesis is just what it means):</w:t>
@@ -115,99 +147,56 @@
     </w:p>
     <w:p>
       <w:pPr>
-        <w:spacing w:before="0" w:after="0"/>
-        <w:ind w:left="432"/>
+        <w:ind w:left="720"/>
       </w:pPr>
       <w:r>
         <w:rPr>
           <w:rFonts w:ascii="Menlo" w:hAnsi="Menlo"/>
-          <w:b/>
-          <w:color w:val="222222"/>
           <w:sz w:val="20"/>
         </w:rPr>
         <w:t>&lt;tag&gt;  &lt;number&gt;  &lt;powder&gt;</w:t>
       </w:r>
+    </w:p>
+    <w:p>
+      <w:pPr>
+        <w:ind w:left="720"/>
+      </w:pPr>
       <w:r>
         <w:rPr>
           <w:rFonts w:ascii="Menlo" w:hAnsi="Menlo"/>
-          <w:color w:val="777777"/>
           <w:sz w:val="20"/>
         </w:rPr>
+        <w:t>P1 45.5 H4350           (Powder Ladder Load 1, 45.5 gr, H4350)</w:t>
       </w:r>
     </w:p>
     <w:p>
       <w:pPr>
-        <w:spacing w:before="0" w:after="0"/>
-        <w:ind w:left="432"/>
+        <w:ind w:left="720"/>
       </w:pPr>
       <w:r>
         <w:rPr>
           <w:rFonts w:ascii="Menlo" w:hAnsi="Menlo"/>
-          <w:b/>
-          <w:color w:val="222222"/>
           <w:sz w:val="20"/>
         </w:rPr>
-        <w:t xml:space="preserve">P1 45.5 H4350         </w:t>
-      </w:r>
-      <w:r>
-        <w:rPr>
-          <w:rFonts w:ascii="Menlo" w:hAnsi="Menlo"/>
-          <w:color w:val="777777"/>
-          <w:sz w:val="20"/>
-        </w:rPr>
-        <w:t xml:space="preserve">  (Powder Ladder Load 1, 45.5 gr, H4350)</w:t>
+        <w:t>S7 0.070 H4350          (Seating Test 7, 0.070" jump, H4350)</w:t>
       </w:r>
     </w:p>
     <w:p>
       <w:pPr>
-        <w:spacing w:before="0" w:after="0"/>
-        <w:ind w:left="432"/>
+        <w:ind w:left="720"/>
       </w:pPr>
       <w:r>
         <w:rPr>
           <w:rFonts w:ascii="Menlo" w:hAnsi="Menlo"/>
-          <w:b/>
-          <w:color w:val="222222"/>
           <w:sz w:val="20"/>
         </w:rPr>
-        <w:t xml:space="preserve">S7 0.070 H4350        </w:t>
-      </w:r>
-      <w:r>
-        <w:rPr>
-          <w:rFonts w:ascii="Menlo" w:hAnsi="Menlo"/>
-          <w:color w:val="777777"/>
-          <w:sz w:val="20"/>
-        </w:rPr>
-        <w:t xml:space="preserve">  (Seating Test 7, 0.070" jump, H4350)</w:t>
-      </w:r>
-    </w:p>
-    <w:p>
-      <w:pPr>
-        <w:spacing w:before="0" w:after="0"/>
-        <w:ind w:left="432"/>
-      </w:pPr>
-      <w:r>
-        <w:rPr>
-          <w:rFonts w:ascii="Menlo" w:hAnsi="Menlo"/>
-          <w:b/>
-          <w:color w:val="222222"/>
-          <w:sz w:val="20"/>
-        </w:rPr>
-        <w:t xml:space="preserve">CONFIRM-1 41.5 H4350  </w:t>
-      </w:r>
-      <w:r>
-        <w:rPr>
-          <w:rFonts w:ascii="Menlo" w:hAnsi="Menlo"/>
-          <w:color w:val="777777"/>
-          <w:sz w:val="20"/>
-        </w:rPr>
-        <w:t xml:space="preserve">  (Confirmation group, 41.5 gr, H4350)</w:t>
+        <w:t>CONFIRM-1 41.5 H4350    (Confirmation group, 41.5 gr, H4350)</w:t>
       </w:r>
     </w:p>
     <w:p>
       <w:r>
         <w:rPr>
-          <w:rFonts w:ascii="Arial" w:hAnsi="Arial"/>
+          <w:b w:val="0"/>
           <w:sz w:val="22"/>
         </w:rPr>
         <w:t>Garmin Xero: in the ShotView app on your phone, name the SESSION using the format above before you export the CSV.</w:t>
@@ -216,84 +205,86 @@
     <w:p>
       <w:r>
         <w:rPr>
-          <w:rFonts w:ascii="Arial" w:hAnsi="Arial"/>
+          <w:b w:val="0"/>
           <w:sz w:val="22"/>
         </w:rPr>
         <w:t>BallisticX: its label field isn't reliable, so RENAME the exported CSV file itself (e.g., 'P1 45.5 H4350.csv'). Cold Bore reads the filename.</w:t>
       </w:r>
     </w:p>
+    <w:p/>
     <w:p>
+      <w:pPr>
+        <w:pStyle w:val="Heading1"/>
+      </w:pPr>
       <w:r>
         <w:rPr>
-          <w:rFonts w:ascii="Arial" w:hAnsi="Arial"/>
-          <w:b/>
-          <w:color w:val="C04A06"/>
-          <w:sz w:val="28"/>
+          <w:color w:val="D97706"/>
         </w:rPr>
         <w:t>Day-to-day</w:t>
       </w:r>
     </w:p>
     <w:p>
+      <w:pPr>
+        <w:ind w:left="360"/>
+      </w:pPr>
       <w:r>
         <w:rPr>
-          <w:rFonts w:ascii="Arial" w:hAnsi="Arial"/>
           <w:b/>
-          <w:color w:val="C04A06"/>
           <w:sz w:val="22"/>
         </w:rPr>
-        <w:t xml:space="preserve">1.  </w:t>
+        <w:t xml:space="preserve">1. </w:t>
       </w:r>
       <w:r>
         <w:rPr>
-          <w:rFonts w:ascii="Arial" w:hAnsi="Arial"/>
           <w:sz w:val="22"/>
         </w:rPr>
         <w:t>Get your Garmin and BallisticX CSVs onto your Mac (AirDrop, iCloud, email, USB — whatever works). Rename BallisticX files to your format.</w:t>
       </w:r>
     </w:p>
     <w:p>
+      <w:pPr>
+        <w:ind w:left="360"/>
+      </w:pPr>
       <w:r>
         <w:rPr>
-          <w:rFonts w:ascii="Arial" w:hAnsi="Arial"/>
           <w:b/>
-          <w:color w:val="C04A06"/>
           <w:sz w:val="22"/>
         </w:rPr>
-        <w:t xml:space="preserve">2.  </w:t>
+        <w:t xml:space="preserve">2. </w:t>
       </w:r>
       <w:r>
         <w:rPr>
-          <w:rFonts w:ascii="Arial" w:hAnsi="Arial"/>
           <w:sz w:val="22"/>
         </w:rPr>
-        <w:t>Quit Excel if it's open. In Finder, put all your CSVs from this range trip in one folder, select them all (click the first, then Cmd+A — or Cmd-click each one), and drag the whole batch onto the Cold Bore icon at once. Cold Bore imports them together and opens the workbook.</w:t>
+        <w:t>Quit Excel if it's open. In Finder, put all your CSVs from this range trip in one folder, select them all (click the first, then Cmd+A — or Cmd-click each one), and drag the whole batch onto the Cold Bore window.</w:t>
       </w:r>
     </w:p>
     <w:p>
+      <w:pPr>
+        <w:ind w:left="360"/>
+      </w:pPr>
       <w:r>
         <w:rPr>
-          <w:rFonts w:ascii="Arial" w:hAnsi="Arial"/>
           <w:b/>
-          <w:color w:val="C04A06"/>
           <w:sz w:val="22"/>
         </w:rPr>
-        <w:t xml:space="preserve">3.  </w:t>
+        <w:t xml:space="preserve">3. </w:t>
       </w:r>
       <w:r>
         <w:rPr>
-          <w:rFonts w:ascii="Arial" w:hAnsi="Arial"/>
           <w:sz w:val="22"/>
         </w:rPr>
         <w:t>Fill in the green Rifle &amp; Shooter info bar (one-time, or whenever it changes) and the Test Session bar (date, temp, notes), then save.</w:t>
       </w:r>
     </w:p>
+    <w:p/>
     <w:p>
+      <w:pPr>
+        <w:pStyle w:val="Heading1"/>
+      </w:pPr>
       <w:r>
         <w:rPr>
-          <w:rFonts w:ascii="Arial" w:hAnsi="Arial"/>
-          <w:b/>
-          <w:color w:val="C04A06"/>
-          <w:sz w:val="28"/>
+          <w:color w:val="D97706"/>
         </w:rPr>
         <w:t>Good to know</w:t>
       </w:r>
@@ -303,10 +294,6 @@
         <w:pStyle w:val="ListBullet"/>
       </w:pPr>
       <w:r>
-        <w:rPr>
-          <w:rFonts w:ascii="Arial" w:hAnsi="Arial"/>
-          <w:sz w:val="22"/>
-        </w:rPr>
         <w:t>Cold Bore needs at least 3 charges (or jumps) before it picks a recommended winner.</w:t>
       </w:r>
     </w:p>
@@ -315,10 +302,6 @@
         <w:pStyle w:val="ListBullet"/>
       </w:pPr>
       <w:r>
-        <w:rPr>
-          <w:rFonts w:ascii="Arial" w:hAnsi="Arial"/>
-          <w:sz w:val="22"/>
-        </w:rPr>
         <w:t>Your workbook is backed up before every import — Tools → Restore From Backup.</w:t>
       </w:r>
     </w:p>
@@ -327,10 +310,6 @@
         <w:pStyle w:val="ListBullet"/>
       </w:pPr>
       <w:r>
-        <w:rPr>
-          <w:rFonts w:ascii="Arial" w:hAnsi="Arial"/>
-          <w:sz w:val="22"/>
-        </w:rPr>
         <w:t>Finished a load? Tools → Start New Cycle archives it and starts fresh.</w:t>
       </w:r>
     </w:p>
@@ -339,11 +318,7 @@
         <w:pStyle w:val="ListBullet"/>
       </w:pPr>
       <w:r>
-        <w:rPr>
-          <w:rFonts w:ascii="Arial" w:hAnsi="Arial"/>
-          <w:sz w:val="22"/>
-        </w:rPr>
-        <w:t>Updates appear as a yellow banner at the top of the window with a download link.</w:t>
+        <w:t>Updates appear as a yellow banner at the top of the window. Click Install Update — Cold Bore downloads in the background (authenticated by your license key), then Quit and Install when ready. The app quits, swaps itself, and reopens at the new version.</w:t>
       </w:r>
     </w:p>
     <w:p>
@@ -351,20 +326,17 @@
         <w:pStyle w:val="ListBullet"/>
       </w:pPr>
       <w:r>
-        <w:rPr>
-          <w:rFonts w:ascii="Arial" w:hAnsi="Arial"/>
-          <w:sz w:val="22"/>
-        </w:rPr>
-        <w:t>Questions, bugs, or other chronographs (LabRadar, MagnetoSpeed): Tools → About for contact info.</w:t>
+        <w:t>Questions, bugs, or other chronographs (LabRadar, MagnetoSpeed): coldboreapp@gmail.com.</w:t>
       </w:r>
     </w:p>
+    <w:p/>
     <w:p>
+      <w:pPr>
+        <w:pStyle w:val="Heading1"/>
+      </w:pPr>
       <w:r>
         <w:rPr>
-          <w:rFonts w:ascii="Arial" w:hAnsi="Arial"/>
-          <w:b/>
-          <w:color w:val="960000"/>
-          <w:sz w:val="28"/>
+          <w:color w:val="D97706"/>
         </w:rPr>
         <w:t>Reminder</w:t>
       </w:r>
@@ -372,15 +344,15 @@
     <w:p>
       <w:r>
         <w:rPr>
-          <w:rFonts w:ascii="Arial" w:hAnsi="Arial"/>
+          <w:b w:val="0"/>
           <w:sz w:val="22"/>
         </w:rPr>
-        <w:t>Cold Bore is a data-analysis tool, not load data. Always cross-reference against published reloading manuals, watch for pressure signs, and start below max. Reloading is inherently dangerous and you are solely responsible for safe practice.</w:t>
+        <w:t>Cold Bore is a data-analysis tool, not load data. Always cross-reference against published reloading manuals, watch for pressure signs, and start below max. Reloading is inherently dangerous and you assume all risk.</w:t>
       </w:r>
     </w:p>
     <w:sectPr>
       <w:pgSz w:w="12240" w:h="15840"/>
-      <w:pgMar w:top="720" w:right="1008" w:bottom="720" w:left="1008" w:header="720" w:footer="720" w:gutter="0"/>
+      <w:pgMar w:top="1440" w:right="1800" w:bottom="1440" w:left="1800" w:header="720" w:footer="720" w:gutter="0"/>
       <w:cols w:space="720"/>
       <w:docGrid w:linePitch="360"/>
     </w:sectPr>
@@ -751,13 +723,6 @@
     <w:name w:val="Normal"/>
     <w:qFormat/>
     <w:rsid w:val="00FC693F"/>
-    <w:pPr>
-      <w:spacing w:before="0" w:after="60" w:line="276" w:lineRule="auto"/>
-    </w:pPr>
-    <w:rPr>
-      <w:rFonts w:ascii="Arial" w:hAnsi="Arial"/>
-      <w:sz w:val="22"/>
-    </w:rPr>
   </w:style>
   <w:style w:type="paragraph" w:styleId="Header">
     <w:name w:val="header"/>

</xml_diff>